<commit_message>
code tested in the cineca g100  HPC cluster
</commit_message>
<xml_diff>
--- a/3) exam - third part - optional HPC project/report/DeLucaLorenzo.docx
+++ b/3) exam - third part - optional HPC project/report/DeLucaLorenzo.docx
@@ -409,21 +409,19 @@
     </w:p>
     <w:p>
       <w:pPr>
-        <w:rPr>
-          <w:rFonts w:ascii="Cambria Math" w:hAnsi="Cambria Math" w:cs="Cambria Math"/>
-          <w:lang w:val="it-IT"/>
-        </w:rPr>
-      </w:pPr>
-      <w:r>
-        <w:rPr>
-          <w:rFonts w:ascii="Cambria Math" w:hAnsi="Cambria Math" w:cs="Cambria Math"/>
+        <w:pStyle w:val="Heading3"/>
+        <w:rPr>
+          <w:lang w:val="it-IT"/>
+        </w:rPr>
+      </w:pPr>
+      <w:r>
+        <w:rPr>
           <w:lang w:val="it-IT"/>
         </w:rPr>
         <w:t>Per calcolare T, d</w:t>
       </w:r>
       <w:r>
         <w:rPr>
-          <w:rFonts w:ascii="Cambria Math" w:hAnsi="Cambria Math" w:cs="Cambria Math"/>
           <w:lang w:val="it-IT"/>
         </w:rPr>
         <w:t>ata la matrice A:</w:t>
@@ -943,6 +941,114 @@
         </w:rPr>
         <w:t xml:space="preserve"> =0</w:t>
       </w:r>
+    </w:p>
+    <w:p>
+      <w:pPr>
+        <w:rPr>
+          <w:lang w:val="it-IT"/>
+        </w:rPr>
+      </w:pPr>
+      <w:r>
+        <w:rPr>
+          <w:lang w:val="it-IT"/>
+        </w:rPr>
+        <w:br w:type="page"/>
+      </w:r>
+    </w:p>
+    <w:p>
+      <w:pPr>
+        <w:pStyle w:val="Heading2"/>
+        <w:rPr>
+          <w:lang w:val="it-IT"/>
+        </w:rPr>
+      </w:pPr>
+      <w:r>
+        <w:rPr>
+          <w:lang w:val="it-IT"/>
+        </w:rPr>
+        <w:lastRenderedPageBreak/>
+        <w:t>Analisi delle prestazioni della soluzione parallela MPI</w:t>
+      </w:r>
+    </w:p>
+    <w:p>
+      <w:pPr>
+        <w:rPr>
+          <w:lang w:val="it-IT"/>
+        </w:rPr>
+      </w:pPr>
+    </w:p>
+    <w:p>
+      <w:pPr>
+        <w:rPr>
+          <w:lang w:val="it-IT"/>
+        </w:rPr>
+      </w:pPr>
+      <w:r>
+        <w:rPr>
+          <w:lang w:val="it-IT"/>
+        </w:rPr>
+        <w:t>Massimo 2 tasks per nodo perché ogni nodo ha 2CPU</w:t>
+      </w:r>
+    </w:p>
+    <w:p>
+      <w:pPr>
+        <w:rPr>
+          <w:lang w:val="it-IT"/>
+        </w:rPr>
+      </w:pPr>
+    </w:p>
+    <w:p>
+      <w:pPr>
+        <w:rPr>
+          <w:lang w:val="it-IT"/>
+        </w:rPr>
+      </w:pPr>
+      <w:r>
+        <w:rPr>
+          <w:lang w:val="it-IT"/>
+        </w:rPr>
+        <w:t>Scalabilità Strong</w:t>
+      </w:r>
+    </w:p>
+    <w:p>
+      <w:pPr>
+        <w:rPr>
+          <w:lang w:val="it-IT"/>
+        </w:rPr>
+      </w:pPr>
+    </w:p>
+    <w:p>
+      <w:pPr>
+        <w:rPr>
+          <w:lang w:val="it-IT"/>
+        </w:rPr>
+      </w:pPr>
+      <w:r>
+        <w:rPr>
+          <w:lang w:val="it-IT"/>
+        </w:rPr>
+        <w:t>Scalabilità Weak</w:t>
+      </w:r>
+    </w:p>
+    <w:p>
+      <w:pPr>
+        <w:rPr>
+          <w:lang w:val="it-IT"/>
+        </w:rPr>
+      </w:pPr>
+      <w:r>
+        <w:rPr>
+          <w:lang w:val="it-IT"/>
+        </w:rPr>
+        <w:t>Carico costante -&gt; numero celle tabella costante</w:t>
+      </w:r>
+    </w:p>
+    <w:p>
+      <w:pPr>
+        <w:rPr>
+          <w:lang w:val="it-IT"/>
+        </w:rPr>
+      </w:pPr>
     </w:p>
     <w:sectPr>
       <w:pgSz w:w="12240" w:h="15840"/>
@@ -1404,7 +1510,6 @@
     <w:next w:val="Normal"/>
     <w:link w:val="Heading3Char"/>
     <w:uiPriority w:val="9"/>
-    <w:semiHidden/>
     <w:unhideWhenUsed/>
     <w:qFormat/>
     <w:rsid w:val="003F2018"/>
@@ -1610,7 +1715,6 @@
     <w:basedOn w:val="DefaultParagraphFont"/>
     <w:link w:val="Heading3"/>
     <w:uiPriority w:val="9"/>
-    <w:semiHidden/>
     <w:rsid w:val="003F2018"/>
     <w:rPr>
       <w:rFonts w:eastAsiaTheme="majorEastAsia" w:cstheme="majorBidi"/>

</xml_diff>